<commit_message>
Rebrand trading guide to match official CNH brand identity
Black background (#000000), Luxury Gold headings/accents (#D4AF37),
white body text, Dark Charcoal callout cards (#1A1A1A) with gold border.
Matches the official Cossa Nexus Holdings brand standard exactly.
</commit_message>
<xml_diff>
--- a/docs/Deriv_Synthetic_Indices_Trading_Guide.docx
+++ b/docs/Deriv_Synthetic_Indices_Trading_Guide.docx
@@ -1,6 +1,7 @@
 
 <file path=word/document.xml><?xml version="1.0" encoding="utf-8"?>
 <w:document xmlns:wpc="http://schemas.microsoft.com/office/word/2010/wordprocessingCanvas" xmlns:mc="http://schemas.openxmlformats.org/markup-compatibility/2006" xmlns:o="urn:schemas-microsoft-com:office:office" xmlns:r="http://schemas.openxmlformats.org/officeDocument/2006/relationships" xmlns:m="http://schemas.openxmlformats.org/officeDocument/2006/math" xmlns:v="urn:schemas-microsoft-com:vml" xmlns:wp14="http://schemas.microsoft.com/office/word/2010/wordprocessingDrawing" xmlns:wp="http://schemas.openxmlformats.org/drawingml/2006/wordprocessingDrawing" xmlns:w10="urn:schemas-microsoft-com:office:word" xmlns:w="http://schemas.openxmlformats.org/wordprocessingml/2006/main" xmlns:w14="http://schemas.microsoft.com/office/word/2010/wordml" xmlns:w15="http://schemas.microsoft.com/office/word/2012/wordml" xmlns:wpg="http://schemas.microsoft.com/office/word/2010/wordprocessingGroup" xmlns:wpi="http://schemas.microsoft.com/office/word/2010/wordprocessingInk" xmlns:wne="http://schemas.microsoft.com/office/word/2006/wordml" xmlns:wps="http://schemas.microsoft.com/office/word/2010/wordprocessingShape" xmlns:cx="http://schemas.microsoft.com/office/drawing/2014/chartex" xmlns:cx1="http://schemas.microsoft.com/office/drawing/2015/9/8/chartex" xmlns:cx2="http://schemas.microsoft.com/office/drawing/2015/10/21/chartex" xmlns:cx3="http://schemas.microsoft.com/office/drawing/2016/5/9/chartex" xmlns:cx4="http://schemas.microsoft.com/office/drawing/2016/5/10/chartex" xmlns:cx5="http://schemas.microsoft.com/office/drawing/2016/5/11/chartex" xmlns:cx6="http://schemas.microsoft.com/office/drawing/2016/5/12/chartex" xmlns:cx7="http://schemas.microsoft.com/office/drawing/2016/5/13/chartex" xmlns:cx8="http://schemas.microsoft.com/office/drawing/2016/5/14/chartex" xmlns:aink="http://schemas.microsoft.com/office/drawing/2016/ink" xmlns:am3d="http://schemas.microsoft.com/office/drawing/2017/model3d" xmlns:w16cex="http://schemas.microsoft.com/office/word/2018/wordml/cex" xmlns:w16cid="http://schemas.microsoft.com/office/word/2016/wordml/cid" xmlns:w16="http://schemas.microsoft.com/office/word/2018/wordml" xmlns:w16sdtdh="http://schemas.microsoft.com/office/word/2020/wordml/sdtdatahash" xmlns:w16se="http://schemas.microsoft.com/office/word/2015/wordml/symex" mc:Ignorable="w14 w15 wp14">
+  <w:background w:color="000000"/>
   <w:body>
     <w:p>
       <w:pPr>
@@ -16,7 +17,7 @@
           <w:rFonts w:ascii="Calibri" w:cs="Calibri" w:eastAsia="Calibri" w:hAnsi="Calibri"/>
           <w:b/>
           <w:bCs/>
-          <w:color w:val="8C6A16"/>
+          <w:color w:val="D4AF37"/>
           <w:sz w:val="28"/>
           <w:szCs w:val="28"/>
         </w:rPr>
@@ -33,7 +34,7 @@
           <w:rFonts w:ascii="Calibri" w:cs="Calibri" w:eastAsia="Calibri" w:hAnsi="Calibri"/>
           <w:b/>
           <w:bCs/>
-          <w:color w:val="000000"/>
+          <w:color w:val="FFFFFF"/>
           <w:sz w:val="56"/>
           <w:szCs w:val="56"/>
         </w:rPr>
@@ -50,7 +51,7 @@
           <w:rFonts w:ascii="Calibri" w:cs="Calibri" w:eastAsia="Calibri" w:hAnsi="Calibri"/>
           <w:b/>
           <w:bCs/>
-          <w:color w:val="000000"/>
+          <w:color w:val="F2D16B"/>
           <w:sz w:val="40"/>
           <w:szCs w:val="40"/>
         </w:rPr>
@@ -67,7 +68,7 @@
           <w:rFonts w:ascii="Calibri" w:cs="Calibri" w:eastAsia="Calibri" w:hAnsi="Calibri"/>
           <w:i/>
           <w:iCs/>
-          <w:color w:val="5F5E5A"/>
+          <w:color w:val="B8B6AC"/>
           <w:sz w:val="24"/>
           <w:szCs w:val="24"/>
         </w:rPr>
@@ -81,7 +82,7 @@
       <w:r>
         <w:rPr>
           <w:rFonts w:ascii="Calibri" w:cs="Calibri" w:eastAsia="Calibri" w:hAnsi="Calibri"/>
-          <w:color w:val="5F5E5A"/>
+          <w:color w:val="B8B6AC"/>
           <w:sz w:val="20"/>
           <w:szCs w:val="20"/>
         </w:rPr>
@@ -118,6 +119,9 @@
     <w:p>
       <w:pPr>
         <w:pStyle w:val="Heading1"/>
+        <w:pBdr>
+          <w:bottom w:val="single" w:color="D4AF37" w:sz="6" w:space="8"/>
+        </w:pBdr>
         <w:spacing w:after="200" w:before="400"/>
       </w:pPr>
       <w:r>
@@ -125,7 +129,7 @@
           <w:rFonts w:ascii="Calibri" w:cs="Calibri" w:eastAsia="Calibri" w:hAnsi="Calibri"/>
           <w:b/>
           <w:bCs/>
-          <w:color w:val="000000"/>
+          <w:color w:val="D4AF37"/>
           <w:sz w:val="32"/>
           <w:szCs w:val="32"/>
         </w:rPr>
@@ -135,10 +139,10 @@
     <w:p>
       <w:pPr>
         <w:pBdr>
-          <w:left w:val="single" w:color="8C6A16" w:sz="24"/>
+          <w:left w:val="single" w:color="D4AF37" w:sz="28"/>
         </w:pBdr>
-        <w:shd w:fill="F2E9C9" w:val="clear"/>
-        <w:spacing w:after="200" w:before="120"/>
+        <w:shd w:fill="1A1A1A" w:val="clear"/>
+        <w:spacing w:after="220" w:before="160"/>
         <w:ind w:left="200"/>
       </w:pPr>
       <w:r>
@@ -146,7 +150,7 @@
           <w:rFonts w:ascii="Calibri" w:cs="Calibri" w:eastAsia="Calibri" w:hAnsi="Calibri"/>
           <w:i/>
           <w:iCs/>
-          <w:color w:val="5A4A10"/>
+          <w:color w:val="F2D16B"/>
           <w:sz w:val="20"/>
           <w:szCs w:val="20"/>
         </w:rPr>
@@ -160,6 +164,7 @@
       <w:r>
         <w:rPr>
           <w:rFonts w:ascii="Calibri" w:cs="Calibri" w:eastAsia="Calibri" w:hAnsi="Calibri"/>
+          <w:color w:val="FFFFFF"/>
           <w:sz w:val="22"/>
           <w:szCs w:val="22"/>
         </w:rPr>
@@ -173,6 +178,7 @@
       <w:r>
         <w:rPr>
           <w:rFonts w:ascii="Calibri" w:cs="Calibri" w:eastAsia="Calibri" w:hAnsi="Calibri"/>
+          <w:color w:val="FFFFFF"/>
           <w:sz w:val="22"/>
           <w:szCs w:val="22"/>
         </w:rPr>
@@ -187,6 +193,9 @@
     <w:p>
       <w:pPr>
         <w:pStyle w:val="Heading1"/>
+        <w:pBdr>
+          <w:bottom w:val="single" w:color="D4AF37" w:sz="6" w:space="8"/>
+        </w:pBdr>
         <w:spacing w:after="200" w:before="400"/>
       </w:pPr>
       <w:r>
@@ -194,7 +203,7 @@
           <w:rFonts w:ascii="Calibri" w:cs="Calibri" w:eastAsia="Calibri" w:hAnsi="Calibri"/>
           <w:b/>
           <w:bCs/>
-          <w:color w:val="000000"/>
+          <w:color w:val="D4AF37"/>
           <w:sz w:val="32"/>
           <w:szCs w:val="32"/>
         </w:rPr>
@@ -228,6 +237,9 @@
     <w:p>
       <w:pPr>
         <w:pStyle w:val="Heading1"/>
+        <w:pBdr>
+          <w:bottom w:val="single" w:color="D4AF37" w:sz="6" w:space="8"/>
+        </w:pBdr>
         <w:spacing w:after="200" w:before="400"/>
       </w:pPr>
       <w:r>
@@ -235,7 +247,7 @@
           <w:rFonts w:ascii="Calibri" w:cs="Calibri" w:eastAsia="Calibri" w:hAnsi="Calibri"/>
           <w:b/>
           <w:bCs/>
-          <w:color w:val="000000"/>
+          <w:color w:val="D4AF37"/>
           <w:sz w:val="32"/>
           <w:szCs w:val="32"/>
         </w:rPr>
@@ -249,6 +261,7 @@
       <w:r>
         <w:rPr>
           <w:rFonts w:ascii="Calibri" w:cs="Calibri" w:eastAsia="Calibri" w:hAnsi="Calibri"/>
+          <w:color w:val="FFFFFF"/>
           <w:sz w:val="22"/>
           <w:szCs w:val="22"/>
         </w:rPr>
@@ -262,6 +275,7 @@
       <w:r>
         <w:rPr>
           <w:rFonts w:ascii="Calibri" w:cs="Calibri" w:eastAsia="Calibri" w:hAnsi="Calibri"/>
+          <w:color w:val="FFFFFF"/>
           <w:sz w:val="22"/>
           <w:szCs w:val="22"/>
         </w:rPr>
@@ -278,7 +292,7 @@
           <w:rFonts w:ascii="Calibri" w:cs="Calibri" w:eastAsia="Calibri" w:hAnsi="Calibri"/>
           <w:b/>
           <w:bCs/>
-          <w:color w:val="8C6A16"/>
+          <w:color w:val="F2D16B"/>
           <w:sz w:val="26"/>
           <w:szCs w:val="26"/>
         </w:rPr>
@@ -292,6 +306,7 @@
       <w:r>
         <w:rPr>
           <w:rFonts w:ascii="Calibri" w:cs="Calibri" w:eastAsia="Calibri" w:hAnsi="Calibri"/>
+          <w:color w:val="FFFFFF"/>
           <w:sz w:val="22"/>
           <w:szCs w:val="22"/>
         </w:rPr>
@@ -308,7 +323,7 @@
           <w:rFonts w:ascii="Calibri" w:cs="Calibri" w:eastAsia="Calibri" w:hAnsi="Calibri"/>
           <w:b/>
           <w:bCs/>
-          <w:color w:val="8C6A16"/>
+          <w:color w:val="F2D16B"/>
           <w:sz w:val="26"/>
           <w:szCs w:val="26"/>
         </w:rPr>
@@ -327,6 +342,7 @@
       <w:r>
         <w:rPr>
           <w:rFonts w:ascii="Calibri" w:cs="Calibri" w:eastAsia="Calibri" w:hAnsi="Calibri"/>
+          <w:color w:val="FFFFFF"/>
           <w:sz w:val="22"/>
           <w:szCs w:val="22"/>
         </w:rPr>
@@ -345,6 +361,7 @@
       <w:r>
         <w:rPr>
           <w:rFonts w:ascii="Calibri" w:cs="Calibri" w:eastAsia="Calibri" w:hAnsi="Calibri"/>
+          <w:color w:val="FFFFFF"/>
           <w:sz w:val="22"/>
           <w:szCs w:val="22"/>
         </w:rPr>
@@ -363,6 +380,7 @@
       <w:r>
         <w:rPr>
           <w:rFonts w:ascii="Calibri" w:cs="Calibri" w:eastAsia="Calibri" w:hAnsi="Calibri"/>
+          <w:color w:val="FFFFFF"/>
           <w:sz w:val="22"/>
           <w:szCs w:val="22"/>
         </w:rPr>
@@ -381,6 +399,7 @@
       <w:r>
         <w:rPr>
           <w:rFonts w:ascii="Calibri" w:cs="Calibri" w:eastAsia="Calibri" w:hAnsi="Calibri"/>
+          <w:color w:val="FFFFFF"/>
           <w:sz w:val="22"/>
           <w:szCs w:val="22"/>
         </w:rPr>
@@ -390,6 +409,9 @@
     <w:p>
       <w:pPr>
         <w:pStyle w:val="Heading1"/>
+        <w:pBdr>
+          <w:bottom w:val="single" w:color="D4AF37" w:sz="6" w:space="8"/>
+        </w:pBdr>
         <w:spacing w:after="200" w:before="400"/>
       </w:pPr>
       <w:r>
@@ -397,7 +419,7 @@
           <w:rFonts w:ascii="Calibri" w:cs="Calibri" w:eastAsia="Calibri" w:hAnsi="Calibri"/>
           <w:b/>
           <w:bCs/>
-          <w:color w:val="000000"/>
+          <w:color w:val="D4AF37"/>
           <w:sz w:val="32"/>
           <w:szCs w:val="32"/>
         </w:rPr>
@@ -411,6 +433,7 @@
       <w:r>
         <w:rPr>
           <w:rFonts w:ascii="Calibri" w:cs="Calibri" w:eastAsia="Calibri" w:hAnsi="Calibri"/>
+          <w:color w:val="FFFFFF"/>
           <w:sz w:val="22"/>
           <w:szCs w:val="22"/>
         </w:rPr>
@@ -427,7 +450,7 @@
           <w:rFonts w:ascii="Calibri" w:cs="Calibri" w:eastAsia="Calibri" w:hAnsi="Calibri"/>
           <w:b/>
           <w:bCs/>
-          <w:color w:val="8C6A16"/>
+          <w:color w:val="F2D16B"/>
           <w:sz w:val="26"/>
           <w:szCs w:val="26"/>
         </w:rPr>
@@ -446,6 +469,7 @@
       <w:r>
         <w:rPr>
           <w:rFonts w:ascii="Calibri" w:cs="Calibri" w:eastAsia="Calibri" w:hAnsi="Calibri"/>
+          <w:color w:val="FFFFFF"/>
           <w:sz w:val="22"/>
           <w:szCs w:val="22"/>
         </w:rPr>
@@ -464,6 +488,7 @@
       <w:r>
         <w:rPr>
           <w:rFonts w:ascii="Calibri" w:cs="Calibri" w:eastAsia="Calibri" w:hAnsi="Calibri"/>
+          <w:color w:val="FFFFFF"/>
           <w:sz w:val="22"/>
           <w:szCs w:val="22"/>
         </w:rPr>
@@ -482,6 +507,7 @@
       <w:r>
         <w:rPr>
           <w:rFonts w:ascii="Calibri" w:cs="Calibri" w:eastAsia="Calibri" w:hAnsi="Calibri"/>
+          <w:color w:val="FFFFFF"/>
           <w:sz w:val="22"/>
           <w:szCs w:val="22"/>
         </w:rPr>
@@ -498,7 +524,7 @@
           <w:rFonts w:ascii="Calibri" w:cs="Calibri" w:eastAsia="Calibri" w:hAnsi="Calibri"/>
           <w:b/>
           <w:bCs/>
-          <w:color w:val="8C6A16"/>
+          <w:color w:val="F2D16B"/>
           <w:sz w:val="26"/>
           <w:szCs w:val="26"/>
         </w:rPr>
@@ -512,6 +538,7 @@
       <w:r>
         <w:rPr>
           <w:rFonts w:ascii="Calibri" w:cs="Calibri" w:eastAsia="Calibri" w:hAnsi="Calibri"/>
+          <w:color w:val="FFFFFF"/>
           <w:sz w:val="22"/>
           <w:szCs w:val="22"/>
         </w:rPr>
@@ -521,10 +548,10 @@
     <w:p>
       <w:pPr>
         <w:pBdr>
-          <w:left w:val="single" w:color="8C6A16" w:sz="24"/>
+          <w:left w:val="single" w:color="D4AF37" w:sz="28"/>
         </w:pBdr>
-        <w:shd w:fill="F2E9C9" w:val="clear"/>
-        <w:spacing w:after="200" w:before="120"/>
+        <w:shd w:fill="1A1A1A" w:val="clear"/>
+        <w:spacing w:after="220" w:before="160"/>
         <w:ind w:left="200"/>
       </w:pPr>
       <w:r>
@@ -532,7 +559,7 @@
           <w:rFonts w:ascii="Calibri" w:cs="Calibri" w:eastAsia="Calibri" w:hAnsi="Calibri"/>
           <w:i/>
           <w:iCs/>
-          <w:color w:val="5A4A10"/>
+          <w:color w:val="F2D16B"/>
           <w:sz w:val="20"/>
           <w:szCs w:val="20"/>
         </w:rPr>
@@ -542,6 +569,9 @@
     <w:p>
       <w:pPr>
         <w:pStyle w:val="Heading1"/>
+        <w:pBdr>
+          <w:bottom w:val="single" w:color="D4AF37" w:sz="6" w:space="8"/>
+        </w:pBdr>
         <w:spacing w:after="200" w:before="400"/>
       </w:pPr>
       <w:r>
@@ -549,7 +579,7 @@
           <w:rFonts w:ascii="Calibri" w:cs="Calibri" w:eastAsia="Calibri" w:hAnsi="Calibri"/>
           <w:b/>
           <w:bCs/>
-          <w:color w:val="000000"/>
+          <w:color w:val="D4AF37"/>
           <w:sz w:val="32"/>
           <w:szCs w:val="32"/>
         </w:rPr>
@@ -563,6 +593,7 @@
       <w:r>
         <w:rPr>
           <w:rFonts w:ascii="Calibri" w:cs="Calibri" w:eastAsia="Calibri" w:hAnsi="Calibri"/>
+          <w:color w:val="FFFFFF"/>
           <w:sz w:val="22"/>
           <w:szCs w:val="22"/>
         </w:rPr>
@@ -579,7 +610,7 @@
           <w:rFonts w:ascii="Calibri" w:cs="Calibri" w:eastAsia="Calibri" w:hAnsi="Calibri"/>
           <w:b/>
           <w:bCs/>
-          <w:color w:val="8C6A16"/>
+          <w:color w:val="F2D16B"/>
           <w:sz w:val="26"/>
           <w:szCs w:val="26"/>
         </w:rPr>
@@ -593,6 +624,7 @@
       <w:r>
         <w:rPr>
           <w:rFonts w:ascii="Calibri" w:cs="Calibri" w:eastAsia="Calibri" w:hAnsi="Calibri"/>
+          <w:color w:val="FFFFFF"/>
           <w:sz w:val="22"/>
           <w:szCs w:val="22"/>
         </w:rPr>
@@ -609,7 +641,7 @@
           <w:rFonts w:ascii="Calibri" w:cs="Calibri" w:eastAsia="Calibri" w:hAnsi="Calibri"/>
           <w:b/>
           <w:bCs/>
-          <w:color w:val="8C6A16"/>
+          <w:color w:val="F2D16B"/>
           <w:sz w:val="26"/>
           <w:szCs w:val="26"/>
         </w:rPr>
@@ -623,6 +655,7 @@
       <w:r>
         <w:rPr>
           <w:rFonts w:ascii="Calibri" w:cs="Calibri" w:eastAsia="Calibri" w:hAnsi="Calibri"/>
+          <w:color w:val="FFFFFF"/>
           <w:sz w:val="22"/>
           <w:szCs w:val="22"/>
         </w:rPr>
@@ -632,10 +665,10 @@
     <w:p>
       <w:pPr>
         <w:pBdr>
-          <w:left w:val="single" w:color="8C6A16" w:sz="24"/>
+          <w:left w:val="single" w:color="D4AF37" w:sz="28"/>
         </w:pBdr>
-        <w:shd w:fill="F2E9C9" w:val="clear"/>
-        <w:spacing w:after="200" w:before="120"/>
+        <w:shd w:fill="1A1A1A" w:val="clear"/>
+        <w:spacing w:after="220" w:before="160"/>
         <w:ind w:left="200"/>
       </w:pPr>
       <w:r>
@@ -643,7 +676,7 @@
           <w:rFonts w:ascii="Calibri" w:cs="Calibri" w:eastAsia="Calibri" w:hAnsi="Calibri"/>
           <w:i/>
           <w:iCs/>
-          <w:color w:val="5A4A10"/>
+          <w:color w:val="F2D16B"/>
           <w:sz w:val="20"/>
           <w:szCs w:val="20"/>
         </w:rPr>
@@ -660,7 +693,7 @@
           <w:rFonts w:ascii="Calibri" w:cs="Calibri" w:eastAsia="Calibri" w:hAnsi="Calibri"/>
           <w:b/>
           <w:bCs/>
-          <w:color w:val="8C6A16"/>
+          <w:color w:val="F2D16B"/>
           <w:sz w:val="26"/>
           <w:szCs w:val="26"/>
         </w:rPr>
@@ -679,6 +712,7 @@
       <w:r>
         <w:rPr>
           <w:rFonts w:ascii="Calibri" w:cs="Calibri" w:eastAsia="Calibri" w:hAnsi="Calibri"/>
+          <w:color w:val="FFFFFF"/>
           <w:sz w:val="22"/>
           <w:szCs w:val="22"/>
         </w:rPr>
@@ -697,6 +731,7 @@
       <w:r>
         <w:rPr>
           <w:rFonts w:ascii="Calibri" w:cs="Calibri" w:eastAsia="Calibri" w:hAnsi="Calibri"/>
+          <w:color w:val="FFFFFF"/>
           <w:sz w:val="22"/>
           <w:szCs w:val="22"/>
         </w:rPr>
@@ -710,6 +745,7 @@
       <w:r>
         <w:rPr>
           <w:rFonts w:ascii="Calibri" w:cs="Calibri" w:eastAsia="Calibri" w:hAnsi="Calibri"/>
+          <w:color w:val="FFFFFF"/>
           <w:sz w:val="22"/>
           <w:szCs w:val="22"/>
         </w:rPr>
@@ -719,6 +755,9 @@
     <w:p>
       <w:pPr>
         <w:pStyle w:val="Heading1"/>
+        <w:pBdr>
+          <w:bottom w:val="single" w:color="D4AF37" w:sz="6" w:space="8"/>
+        </w:pBdr>
         <w:spacing w:after="200" w:before="400"/>
       </w:pPr>
       <w:r>
@@ -726,7 +765,7 @@
           <w:rFonts w:ascii="Calibri" w:cs="Calibri" w:eastAsia="Calibri" w:hAnsi="Calibri"/>
           <w:b/>
           <w:bCs/>
-          <w:color w:val="000000"/>
+          <w:color w:val="D4AF37"/>
           <w:sz w:val="32"/>
           <w:szCs w:val="32"/>
         </w:rPr>
@@ -740,6 +779,7 @@
       <w:r>
         <w:rPr>
           <w:rFonts w:ascii="Calibri" w:cs="Calibri" w:eastAsia="Calibri" w:hAnsi="Calibri"/>
+          <w:color w:val="FFFFFF"/>
           <w:sz w:val="22"/>
           <w:szCs w:val="22"/>
         </w:rPr>
@@ -756,7 +796,7 @@
           <w:rFonts w:ascii="Calibri" w:cs="Calibri" w:eastAsia="Calibri" w:hAnsi="Calibri"/>
           <w:b/>
           <w:bCs/>
-          <w:color w:val="8C6A16"/>
+          <w:color w:val="F2D16B"/>
           <w:sz w:val="26"/>
           <w:szCs w:val="26"/>
         </w:rPr>
@@ -770,6 +810,7 @@
       <w:r>
         <w:rPr>
           <w:rFonts w:ascii="Calibri" w:cs="Calibri" w:eastAsia="Calibri" w:hAnsi="Calibri"/>
+          <w:color w:val="FFFFFF"/>
           <w:sz w:val="22"/>
           <w:szCs w:val="22"/>
         </w:rPr>
@@ -786,7 +827,7 @@
           <w:rFonts w:ascii="Calibri" w:cs="Calibri" w:eastAsia="Calibri" w:hAnsi="Calibri"/>
           <w:b/>
           <w:bCs/>
-          <w:color w:val="8C6A16"/>
+          <w:color w:val="F2D16B"/>
           <w:sz w:val="26"/>
           <w:szCs w:val="26"/>
         </w:rPr>
@@ -800,6 +841,7 @@
       <w:r>
         <w:rPr>
           <w:rFonts w:ascii="Calibri" w:cs="Calibri" w:eastAsia="Calibri" w:hAnsi="Calibri"/>
+          <w:color w:val="FFFFFF"/>
           <w:sz w:val="22"/>
           <w:szCs w:val="22"/>
         </w:rPr>
@@ -816,7 +858,7 @@
           <w:rFonts w:ascii="Calibri" w:cs="Calibri" w:eastAsia="Calibri" w:hAnsi="Calibri"/>
           <w:b/>
           <w:bCs/>
-          <w:color w:val="8C6A16"/>
+          <w:color w:val="F2D16B"/>
           <w:sz w:val="26"/>
           <w:szCs w:val="26"/>
         </w:rPr>
@@ -830,6 +872,7 @@
       <w:r>
         <w:rPr>
           <w:rFonts w:ascii="Calibri" w:cs="Calibri" w:eastAsia="Calibri" w:hAnsi="Calibri"/>
+          <w:color w:val="FFFFFF"/>
           <w:sz w:val="22"/>
           <w:szCs w:val="22"/>
         </w:rPr>
@@ -846,7 +889,7 @@
           <w:rFonts w:ascii="Calibri" w:cs="Calibri" w:eastAsia="Calibri" w:hAnsi="Calibri"/>
           <w:b/>
           <w:bCs/>
-          <w:color w:val="8C6A16"/>
+          <w:color w:val="F2D16B"/>
           <w:sz w:val="26"/>
           <w:szCs w:val="26"/>
         </w:rPr>
@@ -860,6 +903,7 @@
       <w:r>
         <w:rPr>
           <w:rFonts w:ascii="Calibri" w:cs="Calibri" w:eastAsia="Calibri" w:hAnsi="Calibri"/>
+          <w:color w:val="FFFFFF"/>
           <w:sz w:val="22"/>
           <w:szCs w:val="22"/>
         </w:rPr>
@@ -876,7 +920,7 @@
           <w:rFonts w:ascii="Calibri" w:cs="Calibri" w:eastAsia="Calibri" w:hAnsi="Calibri"/>
           <w:b/>
           <w:bCs/>
-          <w:color w:val="8C6A16"/>
+          <w:color w:val="F2D16B"/>
           <w:sz w:val="26"/>
           <w:szCs w:val="26"/>
         </w:rPr>
@@ -886,10 +930,10 @@
     <w:p>
       <w:pPr>
         <w:pBdr>
-          <w:left w:val="single" w:color="8C6A16" w:sz="24"/>
+          <w:left w:val="single" w:color="D4AF37" w:sz="28"/>
         </w:pBdr>
-        <w:shd w:fill="F2E9C9" w:val="clear"/>
-        <w:spacing w:after="200" w:before="120"/>
+        <w:shd w:fill="1A1A1A" w:val="clear"/>
+        <w:spacing w:after="220" w:before="160"/>
         <w:ind w:left="200"/>
       </w:pPr>
       <w:r>
@@ -897,7 +941,7 @@
           <w:rFonts w:ascii="Calibri" w:cs="Calibri" w:eastAsia="Calibri" w:hAnsi="Calibri"/>
           <w:i/>
           <w:iCs/>
-          <w:color w:val="5A4A10"/>
+          <w:color w:val="F2D16B"/>
           <w:sz w:val="20"/>
           <w:szCs w:val="20"/>
         </w:rPr>
@@ -907,6 +951,9 @@
     <w:p>
       <w:pPr>
         <w:pStyle w:val="Heading1"/>
+        <w:pBdr>
+          <w:bottom w:val="single" w:color="D4AF37" w:sz="6" w:space="8"/>
+        </w:pBdr>
         <w:spacing w:after="200" w:before="400"/>
       </w:pPr>
       <w:r>
@@ -914,7 +961,7 @@
           <w:rFonts w:ascii="Calibri" w:cs="Calibri" w:eastAsia="Calibri" w:hAnsi="Calibri"/>
           <w:b/>
           <w:bCs/>
-          <w:color w:val="000000"/>
+          <w:color w:val="D4AF37"/>
           <w:sz w:val="32"/>
           <w:szCs w:val="32"/>
         </w:rPr>
@@ -928,6 +975,7 @@
       <w:r>
         <w:rPr>
           <w:rFonts w:ascii="Calibri" w:cs="Calibri" w:eastAsia="Calibri" w:hAnsi="Calibri"/>
+          <w:color w:val="FFFFFF"/>
           <w:sz w:val="22"/>
           <w:szCs w:val="22"/>
         </w:rPr>
@@ -944,7 +992,7 @@
           <w:rFonts w:ascii="Calibri" w:cs="Calibri" w:eastAsia="Calibri" w:hAnsi="Calibri"/>
           <w:b/>
           <w:bCs/>
-          <w:color w:val="8C6A16"/>
+          <w:color w:val="F2D16B"/>
           <w:sz w:val="26"/>
           <w:szCs w:val="26"/>
         </w:rPr>
@@ -958,6 +1006,7 @@
       <w:r>
         <w:rPr>
           <w:rFonts w:ascii="Calibri" w:cs="Calibri" w:eastAsia="Calibri" w:hAnsi="Calibri"/>
+          <w:color w:val="FFFFFF"/>
           <w:sz w:val="22"/>
           <w:szCs w:val="22"/>
         </w:rPr>
@@ -974,7 +1023,7 @@
           <w:rFonts w:ascii="Calibri" w:cs="Calibri" w:eastAsia="Calibri" w:hAnsi="Calibri"/>
           <w:b/>
           <w:bCs/>
-          <w:color w:val="8C6A16"/>
+          <w:color w:val="F2D16B"/>
           <w:sz w:val="26"/>
           <w:szCs w:val="26"/>
         </w:rPr>
@@ -988,6 +1037,7 @@
       <w:r>
         <w:rPr>
           <w:rFonts w:ascii="Calibri" w:cs="Calibri" w:eastAsia="Calibri" w:hAnsi="Calibri"/>
+          <w:color w:val="FFFFFF"/>
           <w:sz w:val="22"/>
           <w:szCs w:val="22"/>
         </w:rPr>
@@ -1004,7 +1054,7 @@
           <w:rFonts w:ascii="Calibri" w:cs="Calibri" w:eastAsia="Calibri" w:hAnsi="Calibri"/>
           <w:b/>
           <w:bCs/>
-          <w:color w:val="8C6A16"/>
+          <w:color w:val="F2D16B"/>
           <w:sz w:val="26"/>
           <w:szCs w:val="26"/>
         </w:rPr>
@@ -1018,6 +1068,7 @@
       <w:r>
         <w:rPr>
           <w:rFonts w:ascii="Calibri" w:cs="Calibri" w:eastAsia="Calibri" w:hAnsi="Calibri"/>
+          <w:color w:val="FFFFFF"/>
           <w:sz w:val="22"/>
           <w:szCs w:val="22"/>
         </w:rPr>
@@ -1034,7 +1085,7 @@
           <w:rFonts w:ascii="Calibri" w:cs="Calibri" w:eastAsia="Calibri" w:hAnsi="Calibri"/>
           <w:b/>
           <w:bCs/>
-          <w:color w:val="8C6A16"/>
+          <w:color w:val="F2D16B"/>
           <w:sz w:val="26"/>
           <w:szCs w:val="26"/>
         </w:rPr>
@@ -1048,6 +1099,7 @@
       <w:r>
         <w:rPr>
           <w:rFonts w:ascii="Calibri" w:cs="Calibri" w:eastAsia="Calibri" w:hAnsi="Calibri"/>
+          <w:color w:val="FFFFFF"/>
           <w:sz w:val="22"/>
           <w:szCs w:val="22"/>
         </w:rPr>
@@ -1057,6 +1109,9 @@
     <w:p>
       <w:pPr>
         <w:pStyle w:val="Heading1"/>
+        <w:pBdr>
+          <w:bottom w:val="single" w:color="D4AF37" w:sz="6" w:space="8"/>
+        </w:pBdr>
         <w:spacing w:after="200" w:before="400"/>
       </w:pPr>
       <w:r>
@@ -1064,7 +1119,7 @@
           <w:rFonts w:ascii="Calibri" w:cs="Calibri" w:eastAsia="Calibri" w:hAnsi="Calibri"/>
           <w:b/>
           <w:bCs/>
-          <w:color w:val="000000"/>
+          <w:color w:val="D4AF37"/>
           <w:sz w:val="32"/>
           <w:szCs w:val="32"/>
         </w:rPr>
@@ -1083,6 +1138,7 @@
       <w:r>
         <w:rPr>
           <w:rFonts w:ascii="Calibri" w:cs="Calibri" w:eastAsia="Calibri" w:hAnsi="Calibri"/>
+          <w:color w:val="FFFFFF"/>
           <w:sz w:val="22"/>
           <w:szCs w:val="22"/>
         </w:rPr>
@@ -1101,6 +1157,7 @@
       <w:r>
         <w:rPr>
           <w:rFonts w:ascii="Calibri" w:cs="Calibri" w:eastAsia="Calibri" w:hAnsi="Calibri"/>
+          <w:color w:val="FFFFFF"/>
           <w:sz w:val="22"/>
           <w:szCs w:val="22"/>
         </w:rPr>
@@ -1119,6 +1176,7 @@
       <w:r>
         <w:rPr>
           <w:rFonts w:ascii="Calibri" w:cs="Calibri" w:eastAsia="Calibri" w:hAnsi="Calibri"/>
+          <w:color w:val="FFFFFF"/>
           <w:sz w:val="22"/>
           <w:szCs w:val="22"/>
         </w:rPr>
@@ -1137,6 +1195,7 @@
       <w:r>
         <w:rPr>
           <w:rFonts w:ascii="Calibri" w:cs="Calibri" w:eastAsia="Calibri" w:hAnsi="Calibri"/>
+          <w:color w:val="FFFFFF"/>
           <w:sz w:val="22"/>
           <w:szCs w:val="22"/>
         </w:rPr>
@@ -1155,6 +1214,7 @@
       <w:r>
         <w:rPr>
           <w:rFonts w:ascii="Calibri" w:cs="Calibri" w:eastAsia="Calibri" w:hAnsi="Calibri"/>
+          <w:color w:val="FFFFFF"/>
           <w:sz w:val="22"/>
           <w:szCs w:val="22"/>
         </w:rPr>
@@ -1173,6 +1233,7 @@
       <w:r>
         <w:rPr>
           <w:rFonts w:ascii="Calibri" w:cs="Calibri" w:eastAsia="Calibri" w:hAnsi="Calibri"/>
+          <w:color w:val="FFFFFF"/>
           <w:sz w:val="22"/>
           <w:szCs w:val="22"/>
         </w:rPr>
@@ -1191,6 +1252,7 @@
       <w:r>
         <w:rPr>
           <w:rFonts w:ascii="Calibri" w:cs="Calibri" w:eastAsia="Calibri" w:hAnsi="Calibri"/>
+          <w:color w:val="FFFFFF"/>
           <w:sz w:val="22"/>
           <w:szCs w:val="22"/>
         </w:rPr>
@@ -1209,6 +1271,7 @@
       <w:r>
         <w:rPr>
           <w:rFonts w:ascii="Calibri" w:cs="Calibri" w:eastAsia="Calibri" w:hAnsi="Calibri"/>
+          <w:color w:val="FFFFFF"/>
           <w:sz w:val="22"/>
           <w:szCs w:val="22"/>
         </w:rPr>
@@ -1227,6 +1290,7 @@
       <w:r>
         <w:rPr>
           <w:rFonts w:ascii="Calibri" w:cs="Calibri" w:eastAsia="Calibri" w:hAnsi="Calibri"/>
+          <w:color w:val="FFFFFF"/>
           <w:sz w:val="22"/>
           <w:szCs w:val="22"/>
         </w:rPr>
@@ -1245,6 +1309,7 @@
       <w:r>
         <w:rPr>
           <w:rFonts w:ascii="Calibri" w:cs="Calibri" w:eastAsia="Calibri" w:hAnsi="Calibri"/>
+          <w:color w:val="FFFFFF"/>
           <w:sz w:val="22"/>
           <w:szCs w:val="22"/>
         </w:rPr>
@@ -1263,6 +1328,7 @@
       <w:r>
         <w:rPr>
           <w:rFonts w:ascii="Calibri" w:cs="Calibri" w:eastAsia="Calibri" w:hAnsi="Calibri"/>
+          <w:color w:val="FFFFFF"/>
           <w:sz w:val="22"/>
           <w:szCs w:val="22"/>
         </w:rPr>
@@ -1272,6 +1338,9 @@
     <w:p>
       <w:pPr>
         <w:pStyle w:val="Heading1"/>
+        <w:pBdr>
+          <w:bottom w:val="single" w:color="D4AF37" w:sz="6" w:space="8"/>
+        </w:pBdr>
         <w:spacing w:after="200" w:before="400"/>
       </w:pPr>
       <w:r>
@@ -1279,7 +1348,7 @@
           <w:rFonts w:ascii="Calibri" w:cs="Calibri" w:eastAsia="Calibri" w:hAnsi="Calibri"/>
           <w:b/>
           <w:bCs/>
-          <w:color w:val="000000"/>
+          <w:color w:val="D4AF37"/>
           <w:sz w:val="32"/>
           <w:szCs w:val="32"/>
         </w:rPr>
@@ -1298,6 +1367,7 @@
       <w:r>
         <w:rPr>
           <w:rFonts w:ascii="Calibri" w:cs="Calibri" w:eastAsia="Calibri" w:hAnsi="Calibri"/>
+          <w:color w:val="FFFFFF"/>
           <w:sz w:val="22"/>
           <w:szCs w:val="22"/>
         </w:rPr>
@@ -1316,6 +1386,7 @@
       <w:r>
         <w:rPr>
           <w:rFonts w:ascii="Calibri" w:cs="Calibri" w:eastAsia="Calibri" w:hAnsi="Calibri"/>
+          <w:color w:val="FFFFFF"/>
           <w:sz w:val="22"/>
           <w:szCs w:val="22"/>
         </w:rPr>
@@ -1334,6 +1405,7 @@
       <w:r>
         <w:rPr>
           <w:rFonts w:ascii="Calibri" w:cs="Calibri" w:eastAsia="Calibri" w:hAnsi="Calibri"/>
+          <w:color w:val="FFFFFF"/>
           <w:sz w:val="22"/>
           <w:szCs w:val="22"/>
         </w:rPr>
@@ -1352,6 +1424,7 @@
       <w:r>
         <w:rPr>
           <w:rFonts w:ascii="Calibri" w:cs="Calibri" w:eastAsia="Calibri" w:hAnsi="Calibri"/>
+          <w:color w:val="FFFFFF"/>
           <w:sz w:val="22"/>
           <w:szCs w:val="22"/>
         </w:rPr>
@@ -1370,6 +1443,7 @@
       <w:r>
         <w:rPr>
           <w:rFonts w:ascii="Calibri" w:cs="Calibri" w:eastAsia="Calibri" w:hAnsi="Calibri"/>
+          <w:color w:val="FFFFFF"/>
           <w:sz w:val="22"/>
           <w:szCs w:val="22"/>
         </w:rPr>
@@ -1388,6 +1462,7 @@
       <w:r>
         <w:rPr>
           <w:rFonts w:ascii="Calibri" w:cs="Calibri" w:eastAsia="Calibri" w:hAnsi="Calibri"/>
+          <w:color w:val="FFFFFF"/>
           <w:sz w:val="22"/>
           <w:szCs w:val="22"/>
         </w:rPr>
@@ -1406,6 +1481,7 @@
       <w:r>
         <w:rPr>
           <w:rFonts w:ascii="Calibri" w:cs="Calibri" w:eastAsia="Calibri" w:hAnsi="Calibri"/>
+          <w:color w:val="FFFFFF"/>
           <w:sz w:val="22"/>
           <w:szCs w:val="22"/>
         </w:rPr>
@@ -1427,7 +1503,7 @@
           <w:rFonts w:ascii="Calibri" w:cs="Calibri" w:eastAsia="Calibri" w:hAnsi="Calibri"/>
           <w:b/>
           <w:bCs/>
-          <w:color w:val="8C6A16"/>
+          <w:color w:val="F2D16B"/>
           <w:sz w:val="26"/>
           <w:szCs w:val="26"/>
         </w:rPr>
@@ -1441,6 +1517,7 @@
       <w:r>
         <w:rPr>
           <w:rFonts w:ascii="Calibri" w:cs="Calibri" w:eastAsia="Calibri" w:hAnsi="Calibri"/>
+          <w:color w:val="FFFFFF"/>
           <w:sz w:val="22"/>
           <w:szCs w:val="22"/>
         </w:rPr>
@@ -1509,7 +1586,7 @@
     <w:r>
       <w:rPr>
         <w:rFonts w:ascii="Calibri" w:cs="Calibri" w:eastAsia="Calibri" w:hAnsi="Calibri"/>
-        <w:color w:val="5F5E5A"/>
+        <w:color w:val="B8B6AC"/>
         <w:sz w:val="14"/>
         <w:szCs w:val="14"/>
       </w:rPr>
@@ -1518,7 +1595,7 @@
     <w:r>
       <w:rPr>
         <w:rFonts w:ascii="Calibri" w:cs="Calibri" w:eastAsia="Calibri" w:hAnsi="Calibri"/>
-        <w:color w:val="5F5E5A"/>
+        <w:color w:val="B8B6AC"/>
         <w:sz w:val="14"/>
         <w:szCs w:val="14"/>
       </w:rPr>
@@ -1577,7 +1654,7 @@
     <w:r>
       <w:rPr>
         <w:rFonts w:ascii="Calibri" w:cs="Calibri" w:eastAsia="Calibri" w:hAnsi="Calibri"/>
-        <w:color w:val="8C6A16"/>
+        <w:color w:val="D4AF37"/>
         <w:sz w:val="16"/>
         <w:szCs w:val="16"/>
       </w:rPr>

</xml_diff>

<commit_message>
Extend trading guide with the full validated instrument family
New Chapter 4 covers Volatility 10/25/50/100, all five 1-second variants,
Bull/Bear Market indices, and Step Index — matching the 17 instruments
now live in the data pipeline. Renumbered subsequent chapters and fixed
all internal cross-references.
</commit_message>
<xml_diff>
--- a/docs/Deriv_Synthetic_Indices_Trading_Guide.docx
+++ b/docs/Deriv_Synthetic_Indices_Trading_Guide.docx
@@ -72,7 +72,7 @@
           <w:sz w:val="24"/>
           <w:szCs w:val="24"/>
         </w:rPr>
-        <w:t xml:space="preserve">Volatility Indices · Boom · Crash</w:t>
+        <w:t xml:space="preserve">Volatility · Boom · Crash · Bull/Bear · Step</w:t>
       </w:r>
     </w:p>
     <w:p>
@@ -542,7 +542,7 @@
           <w:sz w:val="22"/>
           <w:szCs w:val="22"/>
         </w:rPr>
-        <w:t xml:space="preserve">Because V75 has no persistent trend driver, strategies built on 'this asset is going up because of X' don't apply. What can apply are strategies built on statistical behavior — for example, testing whether price tends to revert toward a recent average after moving unusually far from it (mean-reversion), or whether short bursts of directional movement tend to continue briefly (momentum). Whether either idea holds up is exactly what backtesting is for — see Chapter 4.</w:t>
+        <w:t xml:space="preserve">Because V75 has no persistent trend driver, strategies built on 'this asset is going up because of X' don't apply. What can apply are strategies built on statistical behavior — for example, testing whether price tends to revert toward a recent average after moving unusually far from it (mean-reversion), or whether short bursts of directional movement tend to continue briefly (momentum). Whether either idea holds up is exactly what backtesting is for — see Chapter 6.</w:t>
       </w:r>
     </w:p>
     <w:p>
@@ -749,7 +749,7 @@
           <w:sz w:val="22"/>
           <w:szCs w:val="22"/>
         </w:rPr>
-        <w:t xml:space="preserve">Both approaches need to be backtested honestly before being trusted — see the spike-reversion strategy discussion in Chapter 4, which tests a specific, narrow hypothesis about price behavior immediately after a spike, not an attempt to predict the spike itself.</w:t>
+        <w:t xml:space="preserve">Both approaches need to be backtested honestly before being trusted — see the spike-reversion strategy discussion in Chapter 6, which tests a specific, narrow hypothesis about price behavior immediately after a spike, not an attempt to predict the spike itself.</w:t>
       </w:r>
     </w:p>
     <w:p>
@@ -769,21 +769,21 @@
           <w:sz w:val="32"/>
           <w:szCs w:val="32"/>
         </w:rPr>
-        <w:t xml:space="preserve">4. Core Risk Management Principles</w:t>
-      </w:r>
-    </w:p>
-    <w:p>
-      <w:pPr>
-        <w:spacing w:after="160"/>
-      </w:pPr>
-      <w:r>
-        <w:rPr>
-          <w:rFonts w:ascii="Calibri" w:cs="Calibri" w:eastAsia="Calibri" w:hAnsi="Calibri"/>
-          <w:color w:val="FFFFFF"/>
-          <w:sz w:val="22"/>
-          <w:szCs w:val="22"/>
-        </w:rPr>
-        <w:t xml:space="preserve">Every strategy discussed in this guide — and every signal Cossa Signals will eventually produce — is built around the same non-negotiable risk rules. These apply regardless of which index you're trading.</w:t>
+        <w:t xml:space="preserve">4. The Rest of the Synthetic Index Family</w:t>
+      </w:r>
+    </w:p>
+    <w:p>
+      <w:pPr>
+        <w:spacing w:after="160"/>
+      </w:pPr>
+      <w:r>
+        <w:rPr>
+          <w:rFonts w:ascii="Calibri" w:cs="Calibri" w:eastAsia="Calibri" w:hAnsi="Calibri"/>
+          <w:color w:val="FFFFFF"/>
+          <w:sz w:val="22"/>
+          <w:szCs w:val="22"/>
+        </w:rPr>
+        <w:t xml:space="preserve">Cossa Signals now covers real, validated data for the full range of Deriv's core synthetic indices — not just Volatility 75. Everything below applies the same principles from Chapters 1-3: no real underlying asset, engineered statistical behavior, and no substitute for backtesting before trusting any strategy.</w:t>
       </w:r>
     </w:p>
     <w:p>
@@ -800,21 +800,21 @@
           <w:sz w:val="26"/>
           <w:szCs w:val="26"/>
         </w:rPr>
-        <w:t xml:space="preserve">Position sizing</w:t>
-      </w:r>
-    </w:p>
-    <w:p>
-      <w:pPr>
-        <w:spacing w:after="160"/>
-      </w:pPr>
-      <w:r>
-        <w:rPr>
-          <w:rFonts w:ascii="Calibri" w:cs="Calibri" w:eastAsia="Calibri" w:hAnsi="Calibri"/>
-          <w:color w:val="FFFFFF"/>
-          <w:sz w:val="22"/>
-          <w:szCs w:val="22"/>
-        </w:rPr>
-        <w:t xml:space="preserve">Never risk more than a small, fixed percentage of your account on a single trade — commonly 1-2% among disciplined traders. This single habit does more to keep a trader in the game long-term than any entry strategy. If a trade risks 1% and you're wrong ten times in a row (which will happen eventually, to everyone), you've lost roughly 10%, not your account.</w:t>
+        <w:t xml:space="preserve">Volatility 10, 25, 50, and 100</w:t>
+      </w:r>
+    </w:p>
+    <w:p>
+      <w:pPr>
+        <w:spacing w:after="160"/>
+      </w:pPr>
+      <w:r>
+        <w:rPr>
+          <w:rFonts w:ascii="Calibri" w:cs="Calibri" w:eastAsia="Calibri" w:hAnsi="Calibri"/>
+          <w:color w:val="FFFFFF"/>
+          <w:sz w:val="22"/>
+          <w:szCs w:val="22"/>
+        </w:rPr>
+        <w:t xml:space="preserve">These behave exactly like Volatility 75 in structure — a random walk with no trend driver — but at different fixed volatility levels. Volatility 10 moves the least per candle; Volatility 100 moves the most. A strategy that works on one Volatility index does not automatically work on another: the statistical scale is different, so position sizing and stop-loss distances that suit V10 will likely be far too tight for V100, and vice versa. Each needs its own backtest, not an assumption carried over from V75.</w:t>
       </w:r>
     </w:p>
     <w:p>
@@ -831,21 +831,21 @@
           <w:sz w:val="26"/>
           <w:szCs w:val="26"/>
         </w:rPr>
-        <w:t xml:space="preserve">Stop-loss, every time, no exceptions</w:t>
-      </w:r>
-    </w:p>
-    <w:p>
-      <w:pPr>
-        <w:spacing w:after="160"/>
-      </w:pPr>
-      <w:r>
-        <w:rPr>
-          <w:rFonts w:ascii="Calibri" w:cs="Calibri" w:eastAsia="Calibri" w:hAnsi="Calibri"/>
-          <w:color w:val="FFFFFF"/>
-          <w:sz w:val="22"/>
-          <w:szCs w:val="22"/>
-        </w:rPr>
-        <w:t xml:space="preserve">A stop-loss is an order that automatically closes your position once it moves against you by a set amount. On Boom/Crash indices especially, this is not optional — it is the only thing standing between a normal loss and an account-ending one when a spike occurs.</w:t>
+        <w:t xml:space="preserve">The '1 Second' Volatility Indices (1HZ10V, 1HZ25V, 1HZ50V, 1HZ75V, 1HZ100V)</w:t>
+      </w:r>
+    </w:p>
+    <w:p>
+      <w:pPr>
+        <w:spacing w:after="160"/>
+      </w:pPr>
+      <w:r>
+        <w:rPr>
+          <w:rFonts w:ascii="Calibri" w:cs="Calibri" w:eastAsia="Calibri" w:hAnsi="Calibri"/>
+          <w:color w:val="FFFFFF"/>
+          <w:sz w:val="22"/>
+          <w:szCs w:val="22"/>
+        </w:rPr>
+        <w:t xml:space="preserve">Same statistical design as their standard counterparts, but updating roughly every second instead of every two seconds. This means more candles per unit of time, more noise to filter through, and — practically — a strategy tuned on 1-minute candles may behave differently here purely because more price ticks are packed into the same window. Treat these as a separate instrument for backtesting purposes, not an interchangeable faster version of the standard index.</w:t>
       </w:r>
     </w:p>
     <w:p>
@@ -862,69 +862,21 @@
           <w:sz w:val="26"/>
           <w:szCs w:val="26"/>
         </w:rPr>
-        <w:t xml:space="preserve">Risk-to-reward ratio</w:t>
-      </w:r>
-    </w:p>
-    <w:p>
-      <w:pPr>
-        <w:spacing w:after="160"/>
-      </w:pPr>
-      <w:r>
-        <w:rPr>
-          <w:rFonts w:ascii="Calibri" w:cs="Calibri" w:eastAsia="Calibri" w:hAnsi="Calibri"/>
-          <w:color w:val="FFFFFF"/>
-          <w:sz w:val="22"/>
-          <w:szCs w:val="22"/>
-        </w:rPr>
-        <w:t xml:space="preserve">Before entering any trade, know both your stop-loss level and your target level. A strategy can be profitable even with a win rate below 50%, if winning trades are meaningfully larger than losing ones — this is why backtesting reports both win rate and total return together, never win rate alone.</w:t>
-      </w:r>
-    </w:p>
-    <w:p>
-      <w:pPr>
-        <w:pStyle w:val="Heading2"/>
-        <w:spacing w:after="150" w:before="300"/>
-      </w:pPr>
-      <w:r>
-        <w:rPr>
-          <w:rFonts w:ascii="Calibri" w:cs="Calibri" w:eastAsia="Calibri" w:hAnsi="Calibri"/>
-          <w:b/>
-          <w:bCs/>
-          <w:color w:val="F2D16B"/>
-          <w:sz w:val="26"/>
-          <w:szCs w:val="26"/>
-        </w:rPr>
-        <w:t xml:space="preserve">Drawdown limits</w:t>
-      </w:r>
-    </w:p>
-    <w:p>
-      <w:pPr>
-        <w:spacing w:after="160"/>
-      </w:pPr>
-      <w:r>
-        <w:rPr>
-          <w:rFonts w:ascii="Calibri" w:cs="Calibri" w:eastAsia="Calibri" w:hAnsi="Calibri"/>
-          <w:color w:val="FFFFFF"/>
-          <w:sz w:val="22"/>
-          <w:szCs w:val="22"/>
-        </w:rPr>
-        <w:t xml:space="preserve">Decide, in advance, the maximum percentage decline in your account you're willing to accept before stopping and reassessing — not after it's already happened. A common discipline is pausing trading entirely after a 15-20% drawdown until the strategy and market conditions are reviewed.</w:t>
-      </w:r>
-    </w:p>
-    <w:p>
-      <w:pPr>
-        <w:pStyle w:val="Heading2"/>
-        <w:spacing w:after="150" w:before="300"/>
-      </w:pPr>
-      <w:r>
-        <w:rPr>
-          <w:rFonts w:ascii="Calibri" w:cs="Calibri" w:eastAsia="Calibri" w:hAnsi="Calibri"/>
-          <w:b/>
-          <w:bCs/>
-          <w:color w:val="F2D16B"/>
-          <w:sz w:val="26"/>
-          <w:szCs w:val="26"/>
-        </w:rPr>
-        <w:t xml:space="preserve">The rule that overrides all others</w:t>
+        <w:t xml:space="preserve">Bull Market and Bear Market Indices (RDBULL, RDBEAR)</w:t>
+      </w:r>
+    </w:p>
+    <w:p>
+      <w:pPr>
+        <w:spacing w:after="160"/>
+      </w:pPr>
+      <w:r>
+        <w:rPr>
+          <w:rFonts w:ascii="Calibri" w:cs="Calibri" w:eastAsia="Calibri" w:hAnsi="Calibri"/>
+          <w:color w:val="FFFFFF"/>
+          <w:sz w:val="22"/>
+          <w:szCs w:val="22"/>
+        </w:rPr>
+        <w:t xml:space="preserve">Unlike the Volatility family, these are built with a persistent directional bias baked in by design — Bull Market trends upward on average, Bear Market trends downward on average, both with random noise layered on top. This makes them structurally closer to trend-following territory than mean-reversion territory, which changes which of the strategy frameworks in Chapter 6 is worth testing first.</w:t>
       </w:r>
     </w:p>
     <w:p>
@@ -945,7 +897,38 @@
           <w:sz w:val="20"/>
           <w:szCs w:val="20"/>
         </w:rPr>
-        <w:t xml:space="preserve">  Never trade with money you cannot afford to lose. This applies with extra force to Boom, Crash, and Volatility indices, given their engineered volatility. If you're feeling pressure to 'make back' a loss quickly, stop trading for the day — that pressure is exactly what leads to abandoning the rules above.</w:t>
+        <w:t xml:space="preserve">  A built-in directional bias is not a guarantee of profit in that direction on any given day, week, or trade. It describes the long-run statistical design, not a promise about what happens next. Backtest before trusting this, the same as everything else in this guide.</w:t>
+      </w:r>
+    </w:p>
+    <w:p>
+      <w:pPr>
+        <w:pStyle w:val="Heading2"/>
+        <w:spacing w:after="150" w:before="300"/>
+      </w:pPr>
+      <w:r>
+        <w:rPr>
+          <w:rFonts w:ascii="Calibri" w:cs="Calibri" w:eastAsia="Calibri" w:hAnsi="Calibri"/>
+          <w:b/>
+          <w:bCs/>
+          <w:color w:val="F2D16B"/>
+          <w:sz w:val="26"/>
+          <w:szCs w:val="26"/>
+        </w:rPr>
+        <w:t xml:space="preserve">Step Index (stpRNG)</w:t>
+      </w:r>
+    </w:p>
+    <w:p>
+      <w:pPr>
+        <w:spacing w:after="160"/>
+      </w:pPr>
+      <w:r>
+        <w:rPr>
+          <w:rFonts w:ascii="Calibri" w:cs="Calibri" w:eastAsia="Calibri" w:hAnsi="Calibri"/>
+          <w:color w:val="FFFFFF"/>
+          <w:sz w:val="22"/>
+          <w:szCs w:val="22"/>
+        </w:rPr>
+        <w:t xml:space="preserve">Price moves in small, fixed steps rather than continuous swings — most ticks are small, with occasional larger steps at lower frequency. Deriv's own material notes this index tends to suit technical indicators better than most other synthetics, since the stepped structure is more regular. Still requires the same backtest discipline as every other instrument here before that theoretical suitability is trusted with real capital.</w:t>
       </w:r>
     </w:p>
     <w:p>
@@ -965,21 +948,21 @@
           <w:sz w:val="32"/>
           <w:szCs w:val="32"/>
         </w:rPr>
-        <w:t xml:space="preserve">5. General Strategy Concepts</w:t>
-      </w:r>
-    </w:p>
-    <w:p>
-      <w:pPr>
-        <w:spacing w:after="160"/>
-      </w:pPr>
-      <w:r>
-        <w:rPr>
-          <w:rFonts w:ascii="Calibri" w:cs="Calibri" w:eastAsia="Calibri" w:hAnsi="Calibri"/>
-          <w:color w:val="FFFFFF"/>
-          <w:sz w:val="22"/>
-          <w:szCs w:val="22"/>
-        </w:rPr>
-        <w:t xml:space="preserve">This section explains categories of trading approach, in plain terms, so you understand the reasoning behind what Cossa Signals eventually tests and delivers. None of these are presented as proven — they are frameworks that must be backtested on real historical data before being trusted, exactly as described in the Cossa Signals project itself.</w:t>
+        <w:t xml:space="preserve">5. Core Risk Management Principles</w:t>
+      </w:r>
+    </w:p>
+    <w:p>
+      <w:pPr>
+        <w:spacing w:after="160"/>
+      </w:pPr>
+      <w:r>
+        <w:rPr>
+          <w:rFonts w:ascii="Calibri" w:cs="Calibri" w:eastAsia="Calibri" w:hAnsi="Calibri"/>
+          <w:color w:val="FFFFFF"/>
+          <w:sz w:val="22"/>
+          <w:szCs w:val="22"/>
+        </w:rPr>
+        <w:t xml:space="preserve">Every strategy discussed in this guide — and every signal Cossa Signals will eventually produce — is built around the same non-negotiable risk rules. These apply regardless of which index you're trading.</w:t>
       </w:r>
     </w:p>
     <w:p>
@@ -996,21 +979,21 @@
           <w:sz w:val="26"/>
           <w:szCs w:val="26"/>
         </w:rPr>
-        <w:t xml:space="preserve">Trend-following</w:t>
-      </w:r>
-    </w:p>
-    <w:p>
-      <w:pPr>
-        <w:spacing w:after="160"/>
-      </w:pPr>
-      <w:r>
-        <w:rPr>
-          <w:rFonts w:ascii="Calibri" w:cs="Calibri" w:eastAsia="Calibri" w:hAnsi="Calibri"/>
-          <w:color w:val="FFFFFF"/>
-          <w:sz w:val="22"/>
-          <w:szCs w:val="22"/>
-        </w:rPr>
-        <w:t xml:space="preserve">Enter in the direction price is already moving, on the idea that a moving trend tends to continue briefly before reversing. Commonly measured using moving averages — for example, entering when a short-term average crosses above a longer-term average.</w:t>
+        <w:t xml:space="preserve">Position sizing</w:t>
+      </w:r>
+    </w:p>
+    <w:p>
+      <w:pPr>
+        <w:spacing w:after="160"/>
+      </w:pPr>
+      <w:r>
+        <w:rPr>
+          <w:rFonts w:ascii="Calibri" w:cs="Calibri" w:eastAsia="Calibri" w:hAnsi="Calibri"/>
+          <w:color w:val="FFFFFF"/>
+          <w:sz w:val="22"/>
+          <w:szCs w:val="22"/>
+        </w:rPr>
+        <w:t xml:space="preserve">Never risk more than a small, fixed percentage of your account on a single trade — commonly 1-2% among disciplined traders. This single habit does more to keep a trader in the game long-term than any entry strategy. If a trade risks 1% and you're wrong ten times in a row (which will happen eventually, to everyone), you've lost roughly 10%, not your account.</w:t>
       </w:r>
     </w:p>
     <w:p>
@@ -1027,21 +1010,21 @@
           <w:sz w:val="26"/>
           <w:szCs w:val="26"/>
         </w:rPr>
-        <w:t xml:space="preserve">Mean-reversion</w:t>
-      </w:r>
-    </w:p>
-    <w:p>
-      <w:pPr>
-        <w:spacing w:after="160"/>
-      </w:pPr>
-      <w:r>
-        <w:rPr>
-          <w:rFonts w:ascii="Calibri" w:cs="Calibri" w:eastAsia="Calibri" w:hAnsi="Calibri"/>
-          <w:color w:val="FFFFFF"/>
-          <w:sz w:val="22"/>
-          <w:szCs w:val="22"/>
-        </w:rPr>
-        <w:t xml:space="preserve">Enter against a recent extreme move, on the idea that price tends to drift back toward a recent average after moving unusually far from it. Commonly measured using indicators like RSI (Relative Strength Index), which flags when price has moved further/faster than its recent typical range.</w:t>
+        <w:t xml:space="preserve">Stop-loss, every time, no exceptions</w:t>
+      </w:r>
+    </w:p>
+    <w:p>
+      <w:pPr>
+        <w:spacing w:after="160"/>
+      </w:pPr>
+      <w:r>
+        <w:rPr>
+          <w:rFonts w:ascii="Calibri" w:cs="Calibri" w:eastAsia="Calibri" w:hAnsi="Calibri"/>
+          <w:color w:val="FFFFFF"/>
+          <w:sz w:val="22"/>
+          <w:szCs w:val="22"/>
+        </w:rPr>
+        <w:t xml:space="preserve">A stop-loss is an order that automatically closes your position once it moves against you by a set amount. On Boom/Crash indices especially, this is not optional — it is the only thing standing between a normal loss and an account-ending one when a spike occurs.</w:t>
       </w:r>
     </w:p>
     <w:p>
@@ -1058,21 +1041,21 @@
           <w:sz w:val="26"/>
           <w:szCs w:val="26"/>
         </w:rPr>
-        <w:t xml:space="preserve">Spike-awareness (Boom/Crash specific)</w:t>
-      </w:r>
-    </w:p>
-    <w:p>
-      <w:pPr>
-        <w:spacing w:after="160"/>
-      </w:pPr>
-      <w:r>
-        <w:rPr>
-          <w:rFonts w:ascii="Calibri" w:cs="Calibri" w:eastAsia="Calibri" w:hAnsi="Calibri"/>
-          <w:color w:val="FFFFFF"/>
-          <w:sz w:val="22"/>
-          <w:szCs w:val="22"/>
-        </w:rPr>
-        <w:t xml:space="preserve">Rather than predicting a spike, this approach reacts to one after it has already been statistically detected (an abnormal single-candle move relative to recent volatility), testing whether price behaves in a specific, definable way in the period immediately following.</w:t>
+        <w:t xml:space="preserve">Risk-to-reward ratio</w:t>
+      </w:r>
+    </w:p>
+    <w:p>
+      <w:pPr>
+        <w:spacing w:after="160"/>
+      </w:pPr>
+      <w:r>
+        <w:rPr>
+          <w:rFonts w:ascii="Calibri" w:cs="Calibri" w:eastAsia="Calibri" w:hAnsi="Calibri"/>
+          <w:color w:val="FFFFFF"/>
+          <w:sz w:val="22"/>
+          <w:szCs w:val="22"/>
+        </w:rPr>
+        <w:t xml:space="preserve">Before entering any trade, know both your stop-loss level and your target level. A strategy can be profitable even with a win rate below 50%, if winning trades are meaningfully larger than losing ones — this is why backtesting reports both win rate and total return together, never win rate alone.</w:t>
       </w:r>
     </w:p>
     <w:p>
@@ -1089,21 +1072,59 @@
           <w:sz w:val="26"/>
           <w:szCs w:val="26"/>
         </w:rPr>
-        <w:t xml:space="preserve">Why 'backtested' isn't the same as 'proven'</w:t>
-      </w:r>
-    </w:p>
-    <w:p>
-      <w:pPr>
-        <w:spacing w:after="160"/>
-      </w:pPr>
-      <w:r>
-        <w:rPr>
-          <w:rFonts w:ascii="Calibri" w:cs="Calibri" w:eastAsia="Calibri" w:hAnsi="Calibri"/>
-          <w:color w:val="FFFFFF"/>
-          <w:sz w:val="22"/>
-          <w:szCs w:val="22"/>
-        </w:rPr>
-        <w:t xml:space="preserve">A strategy that performs well on historical data has cleared the first bar, not the final one. The next steps — testing on data the strategy wasn't built using, then paper-trading with no real money at stake — exist specifically to catch strategies that were accidentally fitted to quirks of one specific dataset rather than a real, repeatable pattern.</w:t>
+        <w:t xml:space="preserve">Drawdown limits</w:t>
+      </w:r>
+    </w:p>
+    <w:p>
+      <w:pPr>
+        <w:spacing w:after="160"/>
+      </w:pPr>
+      <w:r>
+        <w:rPr>
+          <w:rFonts w:ascii="Calibri" w:cs="Calibri" w:eastAsia="Calibri" w:hAnsi="Calibri"/>
+          <w:color w:val="FFFFFF"/>
+          <w:sz w:val="22"/>
+          <w:szCs w:val="22"/>
+        </w:rPr>
+        <w:t xml:space="preserve">Decide, in advance, the maximum percentage decline in your account you're willing to accept before stopping and reassessing — not after it's already happened. A common discipline is pausing trading entirely after a 15-20% drawdown until the strategy and market conditions are reviewed.</w:t>
+      </w:r>
+    </w:p>
+    <w:p>
+      <w:pPr>
+        <w:pStyle w:val="Heading2"/>
+        <w:spacing w:after="150" w:before="300"/>
+      </w:pPr>
+      <w:r>
+        <w:rPr>
+          <w:rFonts w:ascii="Calibri" w:cs="Calibri" w:eastAsia="Calibri" w:hAnsi="Calibri"/>
+          <w:b/>
+          <w:bCs/>
+          <w:color w:val="F2D16B"/>
+          <w:sz w:val="26"/>
+          <w:szCs w:val="26"/>
+        </w:rPr>
+        <w:t xml:space="preserve">The rule that overrides all others</w:t>
+      </w:r>
+    </w:p>
+    <w:p>
+      <w:pPr>
+        <w:pBdr>
+          <w:left w:val="single" w:color="D4AF37" w:sz="28"/>
+        </w:pBdr>
+        <w:shd w:fill="1A1A1A" w:val="clear"/>
+        <w:spacing w:after="220" w:before="160"/>
+        <w:ind w:left="200"/>
+      </w:pPr>
+      <w:r>
+        <w:rPr>
+          <w:rFonts w:ascii="Calibri" w:cs="Calibri" w:eastAsia="Calibri" w:hAnsi="Calibri"/>
+          <w:i/>
+          <w:iCs/>
+          <w:color w:val="F2D16B"/>
+          <w:sz w:val="20"/>
+          <w:szCs w:val="20"/>
+        </w:rPr>
+        <w:t xml:space="preserve">  Never trade with money you cannot afford to lose. This applies with extra force to Boom, Crash, and Volatility indices, given their engineered volatility. If you're feeling pressure to 'make back' a loss quickly, stop trading for the day — that pressure is exactly what leads to abandoning the rules above.</w:t>
       </w:r>
     </w:p>
     <w:p>
@@ -1123,216 +1144,145 @@
           <w:sz w:val="32"/>
           <w:szCs w:val="32"/>
         </w:rPr>
-        <w:t xml:space="preserve">6. Glossary</w:t>
-      </w:r>
-    </w:p>
-    <w:p>
-      <w:pPr>
-        <w:pStyle w:val="ListParagraph"/>
-        <w:numPr>
-          <w:ilvl w:val="0"/>
-          <w:numId w:val="2"/>
-        </w:numPr>
-        <w:spacing w:after="100"/>
-      </w:pPr>
-      <w:r>
-        <w:rPr>
-          <w:rFonts w:ascii="Calibri" w:cs="Calibri" w:eastAsia="Calibri" w:hAnsi="Calibri"/>
-          <w:color w:val="FFFFFF"/>
-          <w:sz w:val="22"/>
-          <w:szCs w:val="22"/>
-        </w:rPr>
-        <w:t xml:space="preserve">CFD (Contract for Difference): a financial product that lets you speculate on price movement without owning the underlying asset.</w:t>
-      </w:r>
-    </w:p>
-    <w:p>
-      <w:pPr>
-        <w:pStyle w:val="ListParagraph"/>
-        <w:numPr>
-          <w:ilvl w:val="0"/>
-          <w:numId w:val="2"/>
-        </w:numPr>
-        <w:spacing w:after="100"/>
-      </w:pPr>
-      <w:r>
-        <w:rPr>
-          <w:rFonts w:ascii="Calibri" w:cs="Calibri" w:eastAsia="Calibri" w:hAnsi="Calibri"/>
-          <w:color w:val="FFFFFF"/>
-          <w:sz w:val="22"/>
-          <w:szCs w:val="22"/>
-        </w:rPr>
-        <w:t xml:space="preserve">Spread: the difference between the buy and sell price of an instrument — a cost of trading, paid on every position.</w:t>
-      </w:r>
-    </w:p>
-    <w:p>
-      <w:pPr>
-        <w:pStyle w:val="ListParagraph"/>
-        <w:numPr>
-          <w:ilvl w:val="0"/>
-          <w:numId w:val="2"/>
-        </w:numPr>
-        <w:spacing w:after="100"/>
-      </w:pPr>
-      <w:r>
-        <w:rPr>
-          <w:rFonts w:ascii="Calibri" w:cs="Calibri" w:eastAsia="Calibri" w:hAnsi="Calibri"/>
-          <w:color w:val="FFFFFF"/>
-          <w:sz w:val="22"/>
-          <w:szCs w:val="22"/>
-        </w:rPr>
-        <w:t xml:space="preserve">Stop-loss: an order that automatically closes a losing position once it reaches a defined price.</w:t>
-      </w:r>
-    </w:p>
-    <w:p>
-      <w:pPr>
-        <w:pStyle w:val="ListParagraph"/>
-        <w:numPr>
-          <w:ilvl w:val="0"/>
-          <w:numId w:val="2"/>
-        </w:numPr>
-        <w:spacing w:after="100"/>
-      </w:pPr>
-      <w:r>
-        <w:rPr>
-          <w:rFonts w:ascii="Calibri" w:cs="Calibri" w:eastAsia="Calibri" w:hAnsi="Calibri"/>
-          <w:color w:val="FFFFFF"/>
-          <w:sz w:val="22"/>
-          <w:szCs w:val="22"/>
-        </w:rPr>
-        <w:t xml:space="preserve">Take-profit: an order that automatically closes a winning position once it reaches a defined price.</w:t>
-      </w:r>
-    </w:p>
-    <w:p>
-      <w:pPr>
-        <w:pStyle w:val="ListParagraph"/>
-        <w:numPr>
-          <w:ilvl w:val="0"/>
-          <w:numId w:val="2"/>
-        </w:numPr>
-        <w:spacing w:after="100"/>
-      </w:pPr>
-      <w:r>
-        <w:rPr>
-          <w:rFonts w:ascii="Calibri" w:cs="Calibri" w:eastAsia="Calibri" w:hAnsi="Calibri"/>
-          <w:color w:val="FFFFFF"/>
-          <w:sz w:val="22"/>
-          <w:szCs w:val="22"/>
-        </w:rPr>
-        <w:t xml:space="preserve">Drawdown: the decline from a peak in account value to a subsequent low point, usually expressed as a percentage.</w:t>
-      </w:r>
-    </w:p>
-    <w:p>
-      <w:pPr>
-        <w:pStyle w:val="ListParagraph"/>
-        <w:numPr>
-          <w:ilvl w:val="0"/>
-          <w:numId w:val="2"/>
-        </w:numPr>
-        <w:spacing w:after="100"/>
-      </w:pPr>
-      <w:r>
-        <w:rPr>
-          <w:rFonts w:ascii="Calibri" w:cs="Calibri" w:eastAsia="Calibri" w:hAnsi="Calibri"/>
-          <w:color w:val="FFFFFF"/>
-          <w:sz w:val="22"/>
-          <w:szCs w:val="22"/>
-        </w:rPr>
-        <w:t xml:space="preserve">Sharpe ratio: a measure of return relative to volatility/risk taken — higher generally means a smoother, more consistent performance for the same average return.</w:t>
-      </w:r>
-    </w:p>
-    <w:p>
-      <w:pPr>
-        <w:pStyle w:val="ListParagraph"/>
-        <w:numPr>
-          <w:ilvl w:val="0"/>
-          <w:numId w:val="2"/>
-        </w:numPr>
-        <w:spacing w:after="100"/>
-      </w:pPr>
-      <w:r>
-        <w:rPr>
-          <w:rFonts w:ascii="Calibri" w:cs="Calibri" w:eastAsia="Calibri" w:hAnsi="Calibri"/>
-          <w:color w:val="FFFFFF"/>
-          <w:sz w:val="22"/>
-          <w:szCs w:val="22"/>
-        </w:rPr>
-        <w:t xml:space="preserve">Win rate: the percentage of trades that closed profitably. On its own, not a full picture — must be considered alongside average win size vs. average loss size.</w:t>
-      </w:r>
-    </w:p>
-    <w:p>
-      <w:pPr>
-        <w:pStyle w:val="ListParagraph"/>
-        <w:numPr>
-          <w:ilvl w:val="0"/>
-          <w:numId w:val="2"/>
-        </w:numPr>
-        <w:spacing w:after="100"/>
-      </w:pPr>
-      <w:r>
-        <w:rPr>
-          <w:rFonts w:ascii="Calibri" w:cs="Calibri" w:eastAsia="Calibri" w:hAnsi="Calibri"/>
-          <w:color w:val="FFFFFF"/>
-          <w:sz w:val="22"/>
-          <w:szCs w:val="22"/>
-        </w:rPr>
-        <w:t xml:space="preserve">Backtesting: testing a trading idea against historical price data to see how it would have performed, before risking real money.</w:t>
-      </w:r>
-    </w:p>
-    <w:p>
-      <w:pPr>
-        <w:pStyle w:val="ListParagraph"/>
-        <w:numPr>
-          <w:ilvl w:val="0"/>
-          <w:numId w:val="2"/>
-        </w:numPr>
-        <w:spacing w:after="100"/>
-      </w:pPr>
-      <w:r>
-        <w:rPr>
-          <w:rFonts w:ascii="Calibri" w:cs="Calibri" w:eastAsia="Calibri" w:hAnsi="Calibri"/>
-          <w:color w:val="FFFFFF"/>
-          <w:sz w:val="22"/>
-          <w:szCs w:val="22"/>
-        </w:rPr>
-        <w:t xml:space="preserve">Paper trading: practicing a strategy in real time using a demo account with no real money at stake.</w:t>
-      </w:r>
-    </w:p>
-    <w:p>
-      <w:pPr>
-        <w:pStyle w:val="ListParagraph"/>
-        <w:numPr>
-          <w:ilvl w:val="0"/>
-          <w:numId w:val="2"/>
-        </w:numPr>
-        <w:spacing w:after="100"/>
-      </w:pPr>
-      <w:r>
-        <w:rPr>
-          <w:rFonts w:ascii="Calibri" w:cs="Calibri" w:eastAsia="Calibri" w:hAnsi="Calibri"/>
-          <w:color w:val="FFFFFF"/>
-          <w:sz w:val="22"/>
-          <w:szCs w:val="22"/>
-        </w:rPr>
-        <w:t xml:space="preserve">Tick: the smallest single price movement/update on an instrument — synthetic indices are often measured in ticks rather than time.</w:t>
-      </w:r>
-    </w:p>
-    <w:p>
-      <w:pPr>
-        <w:pStyle w:val="ListParagraph"/>
-        <w:numPr>
-          <w:ilvl w:val="0"/>
-          <w:numId w:val="2"/>
-        </w:numPr>
-        <w:spacing w:after="100"/>
-      </w:pPr>
-      <w:r>
-        <w:rPr>
-          <w:rFonts w:ascii="Calibri" w:cs="Calibri" w:eastAsia="Calibri" w:hAnsi="Calibri"/>
-          <w:color w:val="FFFFFF"/>
-          <w:sz w:val="22"/>
-          <w:szCs w:val="22"/>
-        </w:rPr>
-        <w:t xml:space="preserve">Candle / Candlestick: a chart element showing the open, high, low, and close price over a fixed period (e.g. one minute).</w:t>
+        <w:t xml:space="preserve">6. General Strategy Concepts</w:t>
+      </w:r>
+    </w:p>
+    <w:p>
+      <w:pPr>
+        <w:spacing w:after="160"/>
+      </w:pPr>
+      <w:r>
+        <w:rPr>
+          <w:rFonts w:ascii="Calibri" w:cs="Calibri" w:eastAsia="Calibri" w:hAnsi="Calibri"/>
+          <w:color w:val="FFFFFF"/>
+          <w:sz w:val="22"/>
+          <w:szCs w:val="22"/>
+        </w:rPr>
+        <w:t xml:space="preserve">This section explains categories of trading approach, in plain terms, so you understand the reasoning behind what Cossa Signals eventually tests and delivers. None of these are presented as proven — they are frameworks that must be backtested on real historical data before being trusted, exactly as described in the Cossa Signals project itself.</w:t>
+      </w:r>
+    </w:p>
+    <w:p>
+      <w:pPr>
+        <w:pStyle w:val="Heading2"/>
+        <w:spacing w:after="150" w:before="300"/>
+      </w:pPr>
+      <w:r>
+        <w:rPr>
+          <w:rFonts w:ascii="Calibri" w:cs="Calibri" w:eastAsia="Calibri" w:hAnsi="Calibri"/>
+          <w:b/>
+          <w:bCs/>
+          <w:color w:val="F2D16B"/>
+          <w:sz w:val="26"/>
+          <w:szCs w:val="26"/>
+        </w:rPr>
+        <w:t xml:space="preserve">Trend-following</w:t>
+      </w:r>
+    </w:p>
+    <w:p>
+      <w:pPr>
+        <w:spacing w:after="160"/>
+      </w:pPr>
+      <w:r>
+        <w:rPr>
+          <w:rFonts w:ascii="Calibri" w:cs="Calibri" w:eastAsia="Calibri" w:hAnsi="Calibri"/>
+          <w:color w:val="FFFFFF"/>
+          <w:sz w:val="22"/>
+          <w:szCs w:val="22"/>
+        </w:rPr>
+        <w:t xml:space="preserve">Enter in the direction price is already moving, on the idea that a moving trend tends to continue briefly before reversing. Commonly measured using moving averages — for example, entering when a short-term average crosses above a longer-term average.</w:t>
+      </w:r>
+    </w:p>
+    <w:p>
+      <w:pPr>
+        <w:pStyle w:val="Heading2"/>
+        <w:spacing w:after="150" w:before="300"/>
+      </w:pPr>
+      <w:r>
+        <w:rPr>
+          <w:rFonts w:ascii="Calibri" w:cs="Calibri" w:eastAsia="Calibri" w:hAnsi="Calibri"/>
+          <w:b/>
+          <w:bCs/>
+          <w:color w:val="F2D16B"/>
+          <w:sz w:val="26"/>
+          <w:szCs w:val="26"/>
+        </w:rPr>
+        <w:t xml:space="preserve">Mean-reversion</w:t>
+      </w:r>
+    </w:p>
+    <w:p>
+      <w:pPr>
+        <w:spacing w:after="160"/>
+      </w:pPr>
+      <w:r>
+        <w:rPr>
+          <w:rFonts w:ascii="Calibri" w:cs="Calibri" w:eastAsia="Calibri" w:hAnsi="Calibri"/>
+          <w:color w:val="FFFFFF"/>
+          <w:sz w:val="22"/>
+          <w:szCs w:val="22"/>
+        </w:rPr>
+        <w:t xml:space="preserve">Enter against a recent extreme move, on the idea that price tends to drift back toward a recent average after moving unusually far from it. Commonly measured using indicators like RSI (Relative Strength Index), which flags when price has moved further/faster than its recent typical range.</w:t>
+      </w:r>
+    </w:p>
+    <w:p>
+      <w:pPr>
+        <w:pStyle w:val="Heading2"/>
+        <w:spacing w:after="150" w:before="300"/>
+      </w:pPr>
+      <w:r>
+        <w:rPr>
+          <w:rFonts w:ascii="Calibri" w:cs="Calibri" w:eastAsia="Calibri" w:hAnsi="Calibri"/>
+          <w:b/>
+          <w:bCs/>
+          <w:color w:val="F2D16B"/>
+          <w:sz w:val="26"/>
+          <w:szCs w:val="26"/>
+        </w:rPr>
+        <w:t xml:space="preserve">Spike-awareness (Boom/Crash specific)</w:t>
+      </w:r>
+    </w:p>
+    <w:p>
+      <w:pPr>
+        <w:spacing w:after="160"/>
+      </w:pPr>
+      <w:r>
+        <w:rPr>
+          <w:rFonts w:ascii="Calibri" w:cs="Calibri" w:eastAsia="Calibri" w:hAnsi="Calibri"/>
+          <w:color w:val="FFFFFF"/>
+          <w:sz w:val="22"/>
+          <w:szCs w:val="22"/>
+        </w:rPr>
+        <w:t xml:space="preserve">Rather than predicting a spike, this approach reacts to one after it has already been statistically detected (an abnormal single-candle move relative to recent volatility), testing whether price behaves in a specific, definable way in the period immediately following.</w:t>
+      </w:r>
+    </w:p>
+    <w:p>
+      <w:pPr>
+        <w:pStyle w:val="Heading2"/>
+        <w:spacing w:after="150" w:before="300"/>
+      </w:pPr>
+      <w:r>
+        <w:rPr>
+          <w:rFonts w:ascii="Calibri" w:cs="Calibri" w:eastAsia="Calibri" w:hAnsi="Calibri"/>
+          <w:b/>
+          <w:bCs/>
+          <w:color w:val="F2D16B"/>
+          <w:sz w:val="26"/>
+          <w:szCs w:val="26"/>
+        </w:rPr>
+        <w:t xml:space="preserve">Why 'backtested' isn't the same as 'proven'</w:t>
+      </w:r>
+    </w:p>
+    <w:p>
+      <w:pPr>
+        <w:spacing w:after="160"/>
+      </w:pPr>
+      <w:r>
+        <w:rPr>
+          <w:rFonts w:ascii="Calibri" w:cs="Calibri" w:eastAsia="Calibri" w:hAnsi="Calibri"/>
+          <w:color w:val="FFFFFF"/>
+          <w:sz w:val="22"/>
+          <w:szCs w:val="22"/>
+        </w:rPr>
+        <w:t xml:space="preserve">A strategy that performs well on historical data has cleared the first bar, not the final one. The next steps — testing on data the strategy wasn't built using, then paper-trading with no real money at stake — exist specifically to catch strategies that were accidentally fitted to quirks of one specific dataset rather than a real, repeatable pattern.</w:t>
       </w:r>
     </w:p>
     <w:p>
@@ -1352,7 +1302,236 @@
           <w:sz w:val="32"/>
           <w:szCs w:val="32"/>
         </w:rPr>
-        <w:t xml:space="preserve">7. Getting Started — A Responsible Checklist</w:t>
+        <w:t xml:space="preserve">7. Glossary</w:t>
+      </w:r>
+    </w:p>
+    <w:p>
+      <w:pPr>
+        <w:pStyle w:val="ListParagraph"/>
+        <w:numPr>
+          <w:ilvl w:val="0"/>
+          <w:numId w:val="2"/>
+        </w:numPr>
+        <w:spacing w:after="100"/>
+      </w:pPr>
+      <w:r>
+        <w:rPr>
+          <w:rFonts w:ascii="Calibri" w:cs="Calibri" w:eastAsia="Calibri" w:hAnsi="Calibri"/>
+          <w:color w:val="FFFFFF"/>
+          <w:sz w:val="22"/>
+          <w:szCs w:val="22"/>
+        </w:rPr>
+        <w:t xml:space="preserve">CFD (Contract for Difference): a financial product that lets you speculate on price movement without owning the underlying asset.</w:t>
+      </w:r>
+    </w:p>
+    <w:p>
+      <w:pPr>
+        <w:pStyle w:val="ListParagraph"/>
+        <w:numPr>
+          <w:ilvl w:val="0"/>
+          <w:numId w:val="2"/>
+        </w:numPr>
+        <w:spacing w:after="100"/>
+      </w:pPr>
+      <w:r>
+        <w:rPr>
+          <w:rFonts w:ascii="Calibri" w:cs="Calibri" w:eastAsia="Calibri" w:hAnsi="Calibri"/>
+          <w:color w:val="FFFFFF"/>
+          <w:sz w:val="22"/>
+          <w:szCs w:val="22"/>
+        </w:rPr>
+        <w:t xml:space="preserve">Spread: the difference between the buy and sell price of an instrument — a cost of trading, paid on every position.</w:t>
+      </w:r>
+    </w:p>
+    <w:p>
+      <w:pPr>
+        <w:pStyle w:val="ListParagraph"/>
+        <w:numPr>
+          <w:ilvl w:val="0"/>
+          <w:numId w:val="2"/>
+        </w:numPr>
+        <w:spacing w:after="100"/>
+      </w:pPr>
+      <w:r>
+        <w:rPr>
+          <w:rFonts w:ascii="Calibri" w:cs="Calibri" w:eastAsia="Calibri" w:hAnsi="Calibri"/>
+          <w:color w:val="FFFFFF"/>
+          <w:sz w:val="22"/>
+          <w:szCs w:val="22"/>
+        </w:rPr>
+        <w:t xml:space="preserve">Stop-loss: an order that automatically closes a losing position once it reaches a defined price.</w:t>
+      </w:r>
+    </w:p>
+    <w:p>
+      <w:pPr>
+        <w:pStyle w:val="ListParagraph"/>
+        <w:numPr>
+          <w:ilvl w:val="0"/>
+          <w:numId w:val="2"/>
+        </w:numPr>
+        <w:spacing w:after="100"/>
+      </w:pPr>
+      <w:r>
+        <w:rPr>
+          <w:rFonts w:ascii="Calibri" w:cs="Calibri" w:eastAsia="Calibri" w:hAnsi="Calibri"/>
+          <w:color w:val="FFFFFF"/>
+          <w:sz w:val="22"/>
+          <w:szCs w:val="22"/>
+        </w:rPr>
+        <w:t xml:space="preserve">Take-profit: an order that automatically closes a winning position once it reaches a defined price.</w:t>
+      </w:r>
+    </w:p>
+    <w:p>
+      <w:pPr>
+        <w:pStyle w:val="ListParagraph"/>
+        <w:numPr>
+          <w:ilvl w:val="0"/>
+          <w:numId w:val="2"/>
+        </w:numPr>
+        <w:spacing w:after="100"/>
+      </w:pPr>
+      <w:r>
+        <w:rPr>
+          <w:rFonts w:ascii="Calibri" w:cs="Calibri" w:eastAsia="Calibri" w:hAnsi="Calibri"/>
+          <w:color w:val="FFFFFF"/>
+          <w:sz w:val="22"/>
+          <w:szCs w:val="22"/>
+        </w:rPr>
+        <w:t xml:space="preserve">Drawdown: the decline from a peak in account value to a subsequent low point, usually expressed as a percentage.</w:t>
+      </w:r>
+    </w:p>
+    <w:p>
+      <w:pPr>
+        <w:pStyle w:val="ListParagraph"/>
+        <w:numPr>
+          <w:ilvl w:val="0"/>
+          <w:numId w:val="2"/>
+        </w:numPr>
+        <w:spacing w:after="100"/>
+      </w:pPr>
+      <w:r>
+        <w:rPr>
+          <w:rFonts w:ascii="Calibri" w:cs="Calibri" w:eastAsia="Calibri" w:hAnsi="Calibri"/>
+          <w:color w:val="FFFFFF"/>
+          <w:sz w:val="22"/>
+          <w:szCs w:val="22"/>
+        </w:rPr>
+        <w:t xml:space="preserve">Sharpe ratio: a measure of return relative to volatility/risk taken — higher generally means a smoother, more consistent performance for the same average return.</w:t>
+      </w:r>
+    </w:p>
+    <w:p>
+      <w:pPr>
+        <w:pStyle w:val="ListParagraph"/>
+        <w:numPr>
+          <w:ilvl w:val="0"/>
+          <w:numId w:val="2"/>
+        </w:numPr>
+        <w:spacing w:after="100"/>
+      </w:pPr>
+      <w:r>
+        <w:rPr>
+          <w:rFonts w:ascii="Calibri" w:cs="Calibri" w:eastAsia="Calibri" w:hAnsi="Calibri"/>
+          <w:color w:val="FFFFFF"/>
+          <w:sz w:val="22"/>
+          <w:szCs w:val="22"/>
+        </w:rPr>
+        <w:t xml:space="preserve">Win rate: the percentage of trades that closed profitably. On its own, not a full picture — must be considered alongside average win size vs. average loss size.</w:t>
+      </w:r>
+    </w:p>
+    <w:p>
+      <w:pPr>
+        <w:pStyle w:val="ListParagraph"/>
+        <w:numPr>
+          <w:ilvl w:val="0"/>
+          <w:numId w:val="2"/>
+        </w:numPr>
+        <w:spacing w:after="100"/>
+      </w:pPr>
+      <w:r>
+        <w:rPr>
+          <w:rFonts w:ascii="Calibri" w:cs="Calibri" w:eastAsia="Calibri" w:hAnsi="Calibri"/>
+          <w:color w:val="FFFFFF"/>
+          <w:sz w:val="22"/>
+          <w:szCs w:val="22"/>
+        </w:rPr>
+        <w:t xml:space="preserve">Backtesting: testing a trading idea against historical price data to see how it would have performed, before risking real money.</w:t>
+      </w:r>
+    </w:p>
+    <w:p>
+      <w:pPr>
+        <w:pStyle w:val="ListParagraph"/>
+        <w:numPr>
+          <w:ilvl w:val="0"/>
+          <w:numId w:val="2"/>
+        </w:numPr>
+        <w:spacing w:after="100"/>
+      </w:pPr>
+      <w:r>
+        <w:rPr>
+          <w:rFonts w:ascii="Calibri" w:cs="Calibri" w:eastAsia="Calibri" w:hAnsi="Calibri"/>
+          <w:color w:val="FFFFFF"/>
+          <w:sz w:val="22"/>
+          <w:szCs w:val="22"/>
+        </w:rPr>
+        <w:t xml:space="preserve">Paper trading: practicing a strategy in real time using a demo account with no real money at stake.</w:t>
+      </w:r>
+    </w:p>
+    <w:p>
+      <w:pPr>
+        <w:pStyle w:val="ListParagraph"/>
+        <w:numPr>
+          <w:ilvl w:val="0"/>
+          <w:numId w:val="2"/>
+        </w:numPr>
+        <w:spacing w:after="100"/>
+      </w:pPr>
+      <w:r>
+        <w:rPr>
+          <w:rFonts w:ascii="Calibri" w:cs="Calibri" w:eastAsia="Calibri" w:hAnsi="Calibri"/>
+          <w:color w:val="FFFFFF"/>
+          <w:sz w:val="22"/>
+          <w:szCs w:val="22"/>
+        </w:rPr>
+        <w:t xml:space="preserve">Tick: the smallest single price movement/update on an instrument — synthetic indices are often measured in ticks rather than time.</w:t>
+      </w:r>
+    </w:p>
+    <w:p>
+      <w:pPr>
+        <w:pStyle w:val="ListParagraph"/>
+        <w:numPr>
+          <w:ilvl w:val="0"/>
+          <w:numId w:val="2"/>
+        </w:numPr>
+        <w:spacing w:after="100"/>
+      </w:pPr>
+      <w:r>
+        <w:rPr>
+          <w:rFonts w:ascii="Calibri" w:cs="Calibri" w:eastAsia="Calibri" w:hAnsi="Calibri"/>
+          <w:color w:val="FFFFFF"/>
+          <w:sz w:val="22"/>
+          <w:szCs w:val="22"/>
+        </w:rPr>
+        <w:t xml:space="preserve">Candle / Candlestick: a chart element showing the open, high, low, and close price over a fixed period (e.g. one minute).</w:t>
+      </w:r>
+    </w:p>
+    <w:p>
+      <w:pPr>
+        <w:pStyle w:val="Heading1"/>
+        <w:pBdr>
+          <w:bottom w:val="single" w:color="D4AF37" w:sz="6" w:space="8"/>
+        </w:pBdr>
+        <w:spacing w:after="200" w:before="400"/>
+      </w:pPr>
+      <w:r>
+        <w:rPr>
+          <w:rFonts w:ascii="Calibri" w:cs="Calibri" w:eastAsia="Calibri" w:hAnsi="Calibri"/>
+          <w:b/>
+          <w:bCs/>
+          <w:color w:val="D4AF37"/>
+          <w:sz w:val="32"/>
+          <w:szCs w:val="32"/>
+        </w:rPr>
+        <w:t xml:space="preserve">8. Getting Started — A Responsible Checklist</w:t>
       </w:r>
     </w:p>
     <w:p>
@@ -1485,7 +1664,7 @@
           <w:sz w:val="22"/>
           <w:szCs w:val="22"/>
         </w:rPr>
-        <w:t xml:space="preserve">Revisit Chapter 4 (Risk Management) whenever a losing streak makes you want to change your rules mid-strategy — that urge is exactly when discipline matters most.</w:t>
+        <w:t xml:space="preserve">Revisit Chapter 5 (Risk Management) whenever a losing streak makes you want to change your rules mid-strategy — that urge is exactly when discipline matters most.</w:t>
       </w:r>
     </w:p>
     <w:p>

</xml_diff>